<commit_message>
Restructure action plan into technical labeled format, cut word count
Status/Goal/Contains/Change-needed fields per section instead of
email-style prose. Same 8 links and content, roughly half the length.

Co-Authored-By: Claude Sonnet 5 <noreply@anthropic.com>
</commit_message>
<xml_diff>
--- a/Client-Facing/Sarene_Action_Plan.docx
+++ b/Client-Facing/Sarene_Action_Plan.docx
@@ -4,25 +4,15 @@
   <w:body>
     <w:p>
       <w:pPr>
-        <w:spacing w:after="390"/>
+        <w:spacing w:after="280"/>
       </w:pPr>
       <w:r>
         <w:rPr>
           <w:rFonts w:ascii="Georgia" w:hAnsi="Georgia"/>
           <w:b/>
-          <w:sz w:val="58"/>
+          <w:sz w:val="52"/>
         </w:rPr>
         <w:t>SARENE'S ACTION PLAN</w:t>
-      </w:r>
-    </w:p>
-    <w:p>
-      <w:r>
-        <w:rPr>
-          <w:rFonts w:ascii="Georgia" w:hAnsi="Georgia"/>
-          <w:b w:val="0"/>
-          <w:sz w:val="32"/>
-        </w:rPr>
-        <w:t>How the plan is actually going to unfold</w:t>
       </w:r>
     </w:p>
     <w:p>
@@ -33,120 +23,34 @@
         <w:rPr>
           <w:rFonts w:ascii="Georgia" w:hAnsi="Georgia"/>
           <w:b w:val="0"/>
-          <w:sz w:val="32"/>
+          <w:sz w:val="26"/>
         </w:rPr>
-        <w:t>Hi Sarene,</w:t>
+        <w:t>Status of each item below, not finished content. Approve or note changes per item.</w:t>
       </w:r>
     </w:p>
     <w:p>
       <w:pPr>
-        <w:spacing w:after="320"/>
+        <w:spacing w:before="160" w:after="160"/>
+      </w:pPr>
+      <w:r>
+        <w:rPr>
+          <w:rFonts w:ascii="Georgia" w:hAnsi="Georgia"/>
+          <w:b/>
+          <w:sz w:val="34"/>
+        </w:rPr>
+        <w:t>1. Current Presence</w:t>
+      </w:r>
+    </w:p>
+    <w:p>
+      <w:pPr>
+        <w:spacing w:after="80"/>
+        <w:ind w:left="280"/>
       </w:pPr>
       <w:r>
         <w:rPr>
           <w:rFonts w:ascii="Georgia" w:hAnsi="Georgia"/>
           <w:b w:val="0"/>
-          <w:sz w:val="32"/>
-        </w:rPr>
-        <w:t>This document shows how the plan is actually going to unfold, what each piece is for and why, not a preview of finished content. A few pieces below are placeholders until the final version is ready to drop in.</w:t>
-      </w:r>
-    </w:p>
-    <w:p>
-      <w:pPr>
-        <w:spacing w:before="200" w:after="350"/>
-      </w:pPr>
-      <w:r>
-        <w:rPr>
-          <w:rFonts w:ascii="Georgia" w:hAnsi="Georgia"/>
-          <w:b/>
-          <w:sz w:val="42"/>
-        </w:rPr>
-        <w:t>What Changes On Your Current Presence</w:t>
-      </w:r>
-    </w:p>
-    <w:p>
-      <w:pPr>
-        <w:spacing w:after="320"/>
-      </w:pPr>
-      <w:r>
-        <w:rPr>
-          <w:rFonts w:ascii="Georgia" w:hAnsi="Georgia"/>
-          <w:b w:val="0"/>
-          <w:sz w:val="32"/>
-        </w:rPr>
-        <w:t>We went through your existing accounts. Since this is a personal brand, we're keeping the human side of it intact, none of your 1,400+ existing posts or your highlights are getting archived or deleted. History like that is part of what makes the account feel real, not a reason to clean house.</w:t>
-      </w:r>
-    </w:p>
-    <w:p>
-      <w:pPr>
-        <w:spacing w:after="320"/>
-      </w:pPr>
-      <w:r>
-        <w:rPr>
-          <w:rFonts w:ascii="Georgia" w:hAnsi="Georgia"/>
-          <w:b w:val="0"/>
-          <w:sz w:val="32"/>
-        </w:rPr>
-        <w:t>The one real change: your bio needs rewriting to match your current positioning as a keynote speaker and workshop facilitator.</w:t>
-      </w:r>
-    </w:p>
-    <w:p>
-      <w:pPr>
-        <w:spacing w:before="200" w:after="350"/>
-      </w:pPr>
-      <w:r>
-        <w:rPr>
-          <w:rFonts w:ascii="Georgia" w:hAnsi="Georgia"/>
-          <w:b/>
-          <w:sz w:val="42"/>
-        </w:rPr>
-        <w:t>The Landing Page</w:t>
-      </w:r>
-    </w:p>
-    <w:p>
-      <w:pPr>
-        <w:spacing w:after="320"/>
-      </w:pPr>
-      <w:r>
-        <w:rPr>
-          <w:rFonts w:ascii="Georgia" w:hAnsi="Georgia"/>
-          <w:b/>
-          <w:sz w:val="32"/>
-        </w:rPr>
-        <w:t xml:space="preserve">The goal: </w:t>
-      </w:r>
-      <w:r>
-        <w:rPr>
-          <w:rFonts w:ascii="Georgia" w:hAnsi="Georgia"/>
-          <w:b w:val="0"/>
-          <w:sz w:val="32"/>
-        </w:rPr>
-        <w:t>this page exists for one job, turning someone who's already interested in you, through your content, a referral, or seeing you speak, into an actual booking inquiry. It's not for building awareness, your content and platforms handle that. It only has to work on someone who already knows who you are and is deciding whether to reach out.</w:t>
-      </w:r>
-    </w:p>
-    <w:p>
-      <w:pPr>
-        <w:spacing w:after="320"/>
-      </w:pPr>
-      <w:r>
-        <w:rPr>
-          <w:rFonts w:ascii="Georgia" w:hAnsi="Georgia"/>
-          <w:b w:val="0"/>
-          <w:sz w:val="32"/>
-        </w:rPr>
-        <w:t>What it will contain, and why each piece is there:</w:t>
-      </w:r>
-    </w:p>
-    <w:p>
-      <w:pPr>
-        <w:spacing w:after="200"/>
-        <w:ind w:left="360"/>
-      </w:pPr>
-      <w:r>
-        <w:rPr>
-          <w:rFonts w:ascii="Georgia" w:hAnsi="Georgia"/>
-          <w:b w:val="0"/>
-          <w:sz w:val="32"/>
+          <w:sz w:val="30"/>
         </w:rPr>
         <w:t xml:space="preserve">•  </w:t>
       </w:r>
@@ -154,29 +58,29 @@
         <w:rPr>
           <w:rFonts w:ascii="Georgia" w:hAnsi="Georgia"/>
           <w:b/>
-          <w:sz w:val="32"/>
+          <w:sz w:val="30"/>
         </w:rPr>
-        <w:t>Who you are and what you do</w:t>
+        <w:t xml:space="preserve">Status: </w:t>
       </w:r>
       <w:r>
         <w:rPr>
           <w:rFonts w:ascii="Georgia" w:hAnsi="Georgia"/>
           <w:b w:val="0"/>
-          <w:sz w:val="32"/>
+          <w:sz w:val="30"/>
         </w:rPr>
-        <w:t>, so someone lands on the page and knows in seconds whether this is relevant to them.</w:t>
+        <w:t>no posts or highlights archived, personal brand, history stays.</w:t>
       </w:r>
     </w:p>
     <w:p>
       <w:pPr>
-        <w:spacing w:after="200"/>
-        <w:ind w:left="360"/>
+        <w:spacing w:after="80"/>
+        <w:ind w:left="280"/>
       </w:pPr>
       <w:r>
         <w:rPr>
           <w:rFonts w:ascii="Georgia" w:hAnsi="Georgia"/>
           <w:b w:val="0"/>
-          <w:sz w:val="32"/>
+          <w:sz w:val="30"/>
         </w:rPr>
         <w:t xml:space="preserve">•  </w:t>
       </w:r>
@@ -184,29 +88,42 @@
         <w:rPr>
           <w:rFonts w:ascii="Georgia" w:hAnsi="Georgia"/>
           <w:b/>
-          <w:sz w:val="32"/>
+          <w:sz w:val="30"/>
         </w:rPr>
-        <w:t>The offer and pricing, stated plainly</w:t>
+        <w:t xml:space="preserve">Change needed: </w:t>
       </w:r>
       <w:r>
         <w:rPr>
           <w:rFonts w:ascii="Georgia" w:hAnsi="Georgia"/>
           <w:b w:val="0"/>
-          <w:sz w:val="32"/>
+          <w:sz w:val="30"/>
         </w:rPr>
-        <w:t>, no hidden pricing, no “contact us to find out,” matching how you already operate.</w:t>
+        <w:t>bio rewrite, to match current positioning as keynote speaker and workshop facilitator.</w:t>
       </w:r>
     </w:p>
     <w:p>
       <w:pPr>
-        <w:spacing w:after="200"/>
-        <w:ind w:left="360"/>
+        <w:spacing w:before="160" w:after="160"/>
+      </w:pPr>
+      <w:r>
+        <w:rPr>
+          <w:rFonts w:ascii="Georgia" w:hAnsi="Georgia"/>
+          <w:b/>
+          <w:sz w:val="34"/>
+        </w:rPr>
+        <w:t>2. Landing Page</w:t>
+      </w:r>
+    </w:p>
+    <w:p>
+      <w:pPr>
+        <w:spacing w:after="80"/>
+        <w:ind w:left="280"/>
       </w:pPr>
       <w:r>
         <w:rPr>
           <w:rFonts w:ascii="Georgia" w:hAnsi="Georgia"/>
           <w:b w:val="0"/>
-          <w:sz w:val="32"/>
+          <w:sz w:val="30"/>
         </w:rPr>
         <w:t xml:space="preserve">•  </w:t>
       </w:r>
@@ -214,29 +131,29 @@
         <w:rPr>
           <w:rFonts w:ascii="Georgia" w:hAnsi="Georgia"/>
           <w:b/>
-          <w:sz w:val="32"/>
+          <w:sz w:val="30"/>
         </w:rPr>
-        <w:t>Real proof, not claims</w:t>
+        <w:t xml:space="preserve">Goal: </w:t>
       </w:r>
       <w:r>
         <w:rPr>
           <w:rFonts w:ascii="Georgia" w:hAnsi="Georgia"/>
           <w:b w:val="0"/>
-          <w:sz w:val="32"/>
+          <w:sz w:val="30"/>
         </w:rPr>
-        <w:t>, the certifications, the numbers, the recognition that back up what you're saying.</w:t>
+        <w:t>convert an already-interested visitor into a booking inquiry.</w:t>
       </w:r>
     </w:p>
     <w:p>
       <w:pPr>
-        <w:spacing w:after="200"/>
-        <w:ind w:left="360"/>
+        <w:spacing w:after="80"/>
+        <w:ind w:left="280"/>
       </w:pPr>
       <w:r>
         <w:rPr>
           <w:rFonts w:ascii="Georgia" w:hAnsi="Georgia"/>
           <w:b w:val="0"/>
-          <w:sz w:val="32"/>
+          <w:sz w:val="30"/>
         </w:rPr>
         <w:t xml:space="preserve">•  </w:t>
       </w:r>
@@ -244,29 +161,42 @@
         <w:rPr>
           <w:rFonts w:ascii="Georgia" w:hAnsi="Georgia"/>
           <w:b/>
-          <w:sz w:val="32"/>
+          <w:sz w:val="30"/>
         </w:rPr>
-        <w:t>Video, once real keynote or speaking footage exists.</w:t>
+        <w:t xml:space="preserve">Contains: </w:t>
       </w:r>
       <w:r>
         <w:rPr>
           <w:rFonts w:ascii="Georgia" w:hAnsi="Georgia"/>
           <w:b w:val="0"/>
-          <w:sz w:val="32"/>
+          <w:sz w:val="30"/>
         </w:rPr>
-        <w:t xml:space="preserve"> Someone deciding whether to book a speaker wants to see you speak first, so this becomes the strongest section on the page as soon as footage is available.</w:t>
+        <w:t>who she is, offer and pricing, proof points, video (once footage exists), the Values Gap Assessment, a direct booking form.</w:t>
       </w:r>
     </w:p>
     <w:p>
       <w:pPr>
-        <w:spacing w:after="200"/>
-        <w:ind w:left="360"/>
+        <w:spacing w:before="160" w:after="160"/>
+      </w:pPr>
+      <w:r>
+        <w:rPr>
+          <w:rFonts w:ascii="Georgia" w:hAnsi="Georgia"/>
+          <w:b/>
+          <w:sz w:val="34"/>
+        </w:rPr>
+        <w:t>3. Values Gap Assessment</w:t>
+      </w:r>
+    </w:p>
+    <w:p>
+      <w:pPr>
+        <w:spacing w:after="80"/>
+        <w:ind w:left="280"/>
       </w:pPr>
       <w:r>
         <w:rPr>
           <w:rFonts w:ascii="Georgia" w:hAnsi="Georgia"/>
           <w:b w:val="0"/>
-          <w:sz w:val="32"/>
+          <w:sz w:val="30"/>
         </w:rPr>
         <w:t xml:space="preserve">•  </w:t>
       </w:r>
@@ -274,131 +204,42 @@
         <w:rPr>
           <w:rFonts w:ascii="Georgia" w:hAnsi="Georgia"/>
           <w:b/>
-          <w:sz w:val="32"/>
+          <w:sz w:val="30"/>
         </w:rPr>
-        <w:t>The Values Gap Assessment</w:t>
+        <w:t xml:space="preserve">Goal: </w:t>
       </w:r>
       <w:r>
         <w:rPr>
           <w:rFonts w:ascii="Georgia" w:hAnsi="Georgia"/>
           <w:b w:val="0"/>
-          <w:sz w:val="32"/>
+          <w:sz w:val="30"/>
         </w:rPr>
-        <w:t>, as a lower-commitment next step for someone not ready to reach out directly yet.</w:t>
+        <w:t>a real check on whether a company's stated values show up in practice, leading into a workshop conversation.</w:t>
       </w:r>
     </w:p>
     <w:p>
       <w:pPr>
-        <w:spacing w:after="200"/>
-        <w:ind w:left="360"/>
-      </w:pPr>
-      <w:r>
-        <w:rPr>
-          <w:rFonts w:ascii="Georgia" w:hAnsi="Georgia"/>
-          <w:b w:val="0"/>
-          <w:sz w:val="32"/>
-        </w:rPr>
-        <w:t xml:space="preserve">•  </w:t>
-      </w:r>
-      <w:r>
-        <w:rPr>
-          <w:rFonts w:ascii="Georgia" w:hAnsi="Georgia"/>
-          <w:b/>
-          <w:sz w:val="32"/>
-        </w:rPr>
-        <w:t>A direct booking inquiry form.</w:t>
-      </w:r>
-      <w:r>
-        <w:rPr>
-          <w:rFonts w:ascii="Georgia" w:hAnsi="Georgia"/>
-          <w:b w:val="0"/>
-          <w:sz w:val="32"/>
-        </w:rPr>
-        <w:t xml:space="preserve"> This is the actual point of the whole page, everything above exists to get someone here.</w:t>
-      </w:r>
-    </w:p>
-    <w:p>
-      <w:pPr>
-        <w:spacing w:before="200" w:after="350"/>
+        <w:spacing w:before="160" w:after="160"/>
       </w:pPr>
       <w:r>
         <w:rPr>
           <w:rFonts w:ascii="Georgia" w:hAnsi="Georgia"/>
           <w:b/>
-          <w:sz w:val="42"/>
+          <w:sz w:val="34"/>
         </w:rPr>
-        <w:t>The Values Gap Assessment</w:t>
+        <w:t>4. Video Scripts (4)</w:t>
       </w:r>
     </w:p>
     <w:p>
       <w:pPr>
-        <w:spacing w:after="320"/>
+        <w:spacing w:after="80"/>
+        <w:ind w:left="280"/>
       </w:pPr>
       <w:r>
         <w:rPr>
           <w:rFonts w:ascii="Georgia" w:hAnsi="Georgia"/>
           <w:b/>
-          <w:sz w:val="32"/>
-        </w:rPr>
-        <w:t xml:space="preserve">The goal: </w:t>
-      </w:r>
-      <w:r>
-        <w:rPr>
-          <w:rFonts w:ascii="Georgia" w:hAnsi="Georgia"/>
-          <w:b w:val="0"/>
-          <w:sz w:val="32"/>
-        </w:rPr>
-        <w:t>give someone a genuine, useful way to check whether their own company's stated values actually show up in practice, or whether they're just words on a website, then move them toward booking your workshop.</w:t>
-      </w:r>
-    </w:p>
-    <w:p>
-      <w:pPr>
-        <w:spacing w:after="320"/>
-      </w:pPr>
-      <w:r>
-        <w:rPr>
-          <w:rFonts w:ascii="Georgia" w:hAnsi="Georgia"/>
-          <w:b w:val="0"/>
-          <w:sz w:val="32"/>
-        </w:rPr>
-        <w:t>It has two jobs, and both matter: it has to actually tell someone something true and useful about their own company, and right after, it points them toward you: if you want help closing what you just found, let's talk about bringing the workshop to your team.</w:t>
-      </w:r>
-    </w:p>
-    <w:p>
-      <w:pPr>
-        <w:spacing w:before="200" w:after="350"/>
-      </w:pPr>
-      <w:r>
-        <w:rPr>
-          <w:rFonts w:ascii="Georgia" w:hAnsi="Georgia"/>
-          <w:b/>
-          <w:sz w:val="42"/>
-        </w:rPr>
-        <w:t>Video Scripts, First Batch</w:t>
-      </w:r>
-    </w:p>
-    <w:p>
-      <w:pPr>
-        <w:spacing w:after="320"/>
-      </w:pPr>
-      <w:r>
-        <w:rPr>
-          <w:rFonts w:ascii="Georgia" w:hAnsi="Georgia"/>
-          <w:b w:val="0"/>
-          <w:sz w:val="32"/>
-        </w:rPr>
-        <w:t>Four scripts, ready for your review before anything gets recorded.</w:t>
-      </w:r>
-    </w:p>
-    <w:p>
-      <w:pPr>
-        <w:spacing w:after="120"/>
-      </w:pPr>
-      <w:r>
-        <w:rPr>
-          <w:rFonts w:ascii="Georgia" w:hAnsi="Georgia"/>
-          <w:b/>
-          <w:sz w:val="32"/>
+          <w:sz w:val="30"/>
         </w:rPr>
         <w:t xml:space="preserve">1. </w:t>
       </w:r>
@@ -406,23 +247,23 @@
         <w:rPr>
           <w:rFonts w:ascii="Georgia" w:hAnsi="Georgia"/>
           <w:b/>
-          <w:sz w:val="32"/>
+          <w:sz w:val="30"/>
         </w:rPr>
-        <w:t xml:space="preserve">A Value That Never Changes a Decision  </w:t>
+        <w:t>A Value That Never Changes a Decision</w:t>
       </w:r>
       <w:r>
         <w:rPr>
           <w:rFonts w:ascii="Georgia" w:hAnsi="Georgia"/>
           <w:b w:val="0"/>
-          <w:sz w:val="32"/>
+          <w:sz w:val="30"/>
         </w:rPr>
-        <w:t xml:space="preserve">  </w:t>
+        <w:t xml:space="preserve">   </w:t>
       </w:r>
       <w:hyperlink r:id="rId9">
         <w:r>
           <w:rPr>
             <w:rFonts w:ascii="Georgia" w:hAnsi="Georgia"/>
-            <w:sz w:val="32"/>
+            <w:sz w:val="30"/>
             <w:color w:val="0563C1"/>
             <w:u w:val="single"/>
           </w:rPr>
@@ -432,13 +273,14 @@
     </w:p>
     <w:p>
       <w:pPr>
-        <w:spacing w:after="120"/>
+        <w:spacing w:after="80"/>
+        <w:ind w:left="280"/>
       </w:pPr>
       <w:r>
         <w:rPr>
           <w:rFonts w:ascii="Georgia" w:hAnsi="Georgia"/>
           <w:b/>
-          <w:sz w:val="32"/>
+          <w:sz w:val="30"/>
         </w:rPr>
         <w:t xml:space="preserve">2. </w:t>
       </w:r>
@@ -446,23 +288,23 @@
         <w:rPr>
           <w:rFonts w:ascii="Georgia" w:hAnsi="Georgia"/>
           <w:b/>
-          <w:sz w:val="32"/>
+          <w:sz w:val="30"/>
         </w:rPr>
-        <w:t xml:space="preserve">What My B Corp Certification Taught Me  </w:t>
+        <w:t>What My B Corp Certification Taught Me</w:t>
       </w:r>
       <w:r>
         <w:rPr>
           <w:rFonts w:ascii="Georgia" w:hAnsi="Georgia"/>
           <w:b w:val="0"/>
-          <w:sz w:val="32"/>
+          <w:sz w:val="30"/>
         </w:rPr>
-        <w:t xml:space="preserve">  </w:t>
+        <w:t xml:space="preserve">   </w:t>
       </w:r>
       <w:hyperlink r:id="rId10">
         <w:r>
           <w:rPr>
             <w:rFonts w:ascii="Georgia" w:hAnsi="Georgia"/>
-            <w:sz w:val="32"/>
+            <w:sz w:val="30"/>
             <w:color w:val="0563C1"/>
             <w:u w:val="single"/>
           </w:rPr>
@@ -472,13 +314,14 @@
     </w:p>
     <w:p>
       <w:pPr>
-        <w:spacing w:after="120"/>
+        <w:spacing w:after="80"/>
+        <w:ind w:left="280"/>
       </w:pPr>
       <w:r>
         <w:rPr>
           <w:rFonts w:ascii="Georgia" w:hAnsi="Georgia"/>
           <w:b/>
-          <w:sz w:val="32"/>
+          <w:sz w:val="30"/>
         </w:rPr>
         <w:t xml:space="preserve">3. </w:t>
       </w:r>
@@ -486,23 +329,23 @@
         <w:rPr>
           <w:rFonts w:ascii="Georgia" w:hAnsi="Georgia"/>
           <w:b/>
-          <w:sz w:val="32"/>
+          <w:sz w:val="30"/>
         </w:rPr>
-        <w:t xml:space="preserve">Knowing When You Shouldn't Be the One Deciding  </w:t>
+        <w:t>Knowing When You Shouldn't Be the One Deciding</w:t>
       </w:r>
       <w:r>
         <w:rPr>
           <w:rFonts w:ascii="Georgia" w:hAnsi="Georgia"/>
           <w:b w:val="0"/>
-          <w:sz w:val="32"/>
+          <w:sz w:val="30"/>
         </w:rPr>
-        <w:t xml:space="preserve">  </w:t>
+        <w:t xml:space="preserve">   </w:t>
       </w:r>
       <w:hyperlink r:id="rId11">
         <w:r>
           <w:rPr>
             <w:rFonts w:ascii="Georgia" w:hAnsi="Georgia"/>
-            <w:sz w:val="32"/>
+            <w:sz w:val="30"/>
             <w:color w:val="0563C1"/>
             <w:u w:val="single"/>
           </w:rPr>
@@ -512,13 +355,14 @@
     </w:p>
     <w:p>
       <w:pPr>
-        <w:spacing w:after="120"/>
+        <w:spacing w:after="80"/>
+        <w:ind w:left="280"/>
       </w:pPr>
       <w:r>
         <w:rPr>
           <w:rFonts w:ascii="Georgia" w:hAnsi="Georgia"/>
           <w:b/>
-          <w:sz w:val="32"/>
+          <w:sz w:val="30"/>
         </w:rPr>
         <w:t xml:space="preserve">4. </w:t>
       </w:r>
@@ -526,23 +370,23 @@
         <w:rPr>
           <w:rFonts w:ascii="Georgia" w:hAnsi="Georgia"/>
           <w:b/>
-          <w:sz w:val="32"/>
+          <w:sz w:val="30"/>
         </w:rPr>
-        <w:t xml:space="preserve">Good Leadership or Bad Leadership (a quick back-and-forth format)  </w:t>
+        <w:t>Good Leadership or Bad Leadership</w:t>
       </w:r>
       <w:r>
         <w:rPr>
           <w:rFonts w:ascii="Georgia" w:hAnsi="Georgia"/>
           <w:b w:val="0"/>
-          <w:sz w:val="32"/>
+          <w:sz w:val="30"/>
         </w:rPr>
-        <w:t xml:space="preserve">  </w:t>
+        <w:t xml:space="preserve">   </w:t>
       </w:r>
       <w:hyperlink r:id="rId12">
         <w:r>
           <w:rPr>
             <w:rFonts w:ascii="Georgia" w:hAnsi="Georgia"/>
-            <w:sz w:val="32"/>
+            <w:sz w:val="30"/>
             <w:color w:val="0563C1"/>
             <w:u w:val="single"/>
           </w:rPr>
@@ -558,33 +402,34 @@
         <w:rPr>
           <w:rFonts w:ascii="Georgia" w:hAnsi="Georgia"/>
           <w:b w:val="0"/>
-          <w:sz w:val="32"/>
+          <w:sz w:val="26"/>
         </w:rPr>
-        <w:t>One note on script 4: one of the questions, defending an employee in front of a customer even when they were wrong, is left open on purpose. We'd rather hear your real answer than guess at it.</w:t>
+        <w:t>Note: script 4, one answer (defending an employee in front of a customer) is left blank on purpose, needs her real answer.</w:t>
       </w:r>
     </w:p>
     <w:p>
       <w:pPr>
-        <w:spacing w:before="200" w:after="350"/>
+        <w:spacing w:before="160" w:after="160"/>
       </w:pPr>
       <w:r>
         <w:rPr>
           <w:rFonts w:ascii="Georgia" w:hAnsi="Georgia"/>
           <w:b/>
-          <w:sz w:val="42"/>
+          <w:sz w:val="34"/>
         </w:rPr>
-        <w:t>LinkedIn Posts, First Batch</w:t>
+        <w:t>5. LinkedIn Posts (3)</w:t>
       </w:r>
     </w:p>
     <w:p>
       <w:pPr>
-        <w:spacing w:after="120"/>
+        <w:spacing w:after="80"/>
+        <w:ind w:left="280"/>
       </w:pPr>
       <w:r>
         <w:rPr>
           <w:rFonts w:ascii="Georgia" w:hAnsi="Georgia"/>
           <w:b/>
-          <w:sz w:val="32"/>
+          <w:sz w:val="30"/>
         </w:rPr>
         <w:t xml:space="preserve">1. </w:t>
       </w:r>
@@ -592,23 +437,23 @@
         <w:rPr>
           <w:rFonts w:ascii="Georgia" w:hAnsi="Georgia"/>
           <w:b/>
-          <w:sz w:val="32"/>
+          <w:sz w:val="30"/>
         </w:rPr>
-        <w:t xml:space="preserve">On the B Corp certification  </w:t>
+        <w:t>B Corp certification</w:t>
       </w:r>
       <w:r>
         <w:rPr>
           <w:rFonts w:ascii="Georgia" w:hAnsi="Georgia"/>
           <w:b w:val="0"/>
-          <w:sz w:val="32"/>
+          <w:sz w:val="30"/>
         </w:rPr>
-        <w:t xml:space="preserve">  </w:t>
+        <w:t xml:space="preserve">   </w:t>
       </w:r>
       <w:hyperlink r:id="rId13">
         <w:r>
           <w:rPr>
             <w:rFonts w:ascii="Georgia" w:hAnsi="Georgia"/>
-            <w:sz w:val="32"/>
+            <w:sz w:val="30"/>
             <w:color w:val="0563C1"/>
             <w:u w:val="single"/>
           </w:rPr>
@@ -618,13 +463,14 @@
     </w:p>
     <w:p>
       <w:pPr>
-        <w:spacing w:after="120"/>
+        <w:spacing w:after="80"/>
+        <w:ind w:left="280"/>
       </w:pPr>
       <w:r>
         <w:rPr>
           <w:rFonts w:ascii="Georgia" w:hAnsi="Georgia"/>
           <w:b/>
-          <w:sz w:val="32"/>
+          <w:sz w:val="30"/>
         </w:rPr>
         <w:t xml:space="preserve">2. </w:t>
       </w:r>
@@ -632,23 +478,23 @@
         <w:rPr>
           <w:rFonts w:ascii="Georgia" w:hAnsi="Georgia"/>
           <w:b/>
-          <w:sz w:val="32"/>
+          <w:sz w:val="30"/>
         </w:rPr>
-        <w:t xml:space="preserve">On how your team is built around individual strengths  </w:t>
+        <w:t>Team built around individual strengths</w:t>
       </w:r>
       <w:r>
         <w:rPr>
           <w:rFonts w:ascii="Georgia" w:hAnsi="Georgia"/>
           <w:b w:val="0"/>
-          <w:sz w:val="32"/>
+          <w:sz w:val="30"/>
         </w:rPr>
-        <w:t xml:space="preserve">  </w:t>
+        <w:t xml:space="preserve">   </w:t>
       </w:r>
       <w:hyperlink r:id="rId14">
         <w:r>
           <w:rPr>
             <w:rFonts w:ascii="Georgia" w:hAnsi="Georgia"/>
-            <w:sz w:val="32"/>
+            <w:sz w:val="30"/>
             <w:color w:val="0563C1"/>
             <w:u w:val="single"/>
           </w:rPr>
@@ -658,13 +504,14 @@
     </w:p>
     <w:p>
       <w:pPr>
-        <w:spacing w:after="120"/>
+        <w:spacing w:after="80"/>
+        <w:ind w:left="280"/>
       </w:pPr>
       <w:r>
         <w:rPr>
           <w:rFonts w:ascii="Georgia" w:hAnsi="Georgia"/>
           <w:b/>
-          <w:sz w:val="32"/>
+          <w:sz w:val="30"/>
         </w:rPr>
         <w:t xml:space="preserve">3. </w:t>
       </w:r>
@@ -672,23 +519,23 @@
         <w:rPr>
           <w:rFonts w:ascii="Georgia" w:hAnsi="Georgia"/>
           <w:b/>
-          <w:sz w:val="32"/>
+          <w:sz w:val="30"/>
         </w:rPr>
-        <w:t xml:space="preserve">On what turns a customer into a lifelong relationship  </w:t>
+        <w:t>What turns a customer into a lifelong relationship</w:t>
       </w:r>
       <w:r>
         <w:rPr>
           <w:rFonts w:ascii="Georgia" w:hAnsi="Georgia"/>
           <w:b w:val="0"/>
-          <w:sz w:val="32"/>
+          <w:sz w:val="30"/>
         </w:rPr>
-        <w:t xml:space="preserve">  </w:t>
+        <w:t xml:space="preserve">   </w:t>
       </w:r>
       <w:hyperlink r:id="rId15">
         <w:r>
           <w:rPr>
             <w:rFonts w:ascii="Georgia" w:hAnsi="Georgia"/>
-            <w:sz w:val="32"/>
+            <w:sz w:val="30"/>
             <w:color w:val="0563C1"/>
             <w:u w:val="single"/>
           </w:rPr>
@@ -698,15 +545,69 @@
     </w:p>
     <w:p>
       <w:pPr>
-        <w:spacing w:before="200" w:after="350"/>
+        <w:spacing w:before="160" w:after="160"/>
       </w:pPr>
       <w:r>
         <w:rPr>
           <w:rFonts w:ascii="Georgia" w:hAnsi="Georgia"/>
           <w:b/>
-          <w:sz w:val="42"/>
+          <w:sz w:val="34"/>
         </w:rPr>
-        <w:t>Instagram Post, First Batch</w:t>
+        <w:t>6. Instagram Post (1)</w:t>
+      </w:r>
+    </w:p>
+    <w:p>
+      <w:pPr>
+        <w:spacing w:after="80"/>
+        <w:ind w:left="280"/>
+      </w:pPr>
+      <w:r>
+        <w:rPr>
+          <w:rFonts w:ascii="Georgia" w:hAnsi="Georgia"/>
+          <w:b w:val="0"/>
+          <w:sz w:val="30"/>
+        </w:rPr>
+        <w:t xml:space="preserve">•  </w:t>
+      </w:r>
+      <w:r>
+        <w:rPr>
+          <w:rFonts w:ascii="Georgia" w:hAnsi="Georgia"/>
+          <w:b/>
+          <w:sz w:val="30"/>
+        </w:rPr>
+        <w:t>Personal carousel</w:t>
+      </w:r>
+      <w:r>
+        <w:rPr>
+          <w:rFonts w:ascii="Georgia" w:hAnsi="Georgia"/>
+          <w:b w:val="0"/>
+          <w:sz w:val="30"/>
+        </w:rPr>
+        <w:t xml:space="preserve">   </w:t>
+      </w:r>
+      <w:hyperlink r:id="rId16">
+        <w:r>
+          <w:rPr>
+            <w:rFonts w:ascii="Georgia" w:hAnsi="Georgia"/>
+            <w:sz w:val="30"/>
+            <w:color w:val="0563C1"/>
+            <w:u w:val="single"/>
+          </w:rPr>
+          <w:t>View post</w:t>
+        </w:r>
+      </w:hyperlink>
+    </w:p>
+    <w:p>
+      <w:pPr>
+        <w:spacing w:before="160" w:after="160"/>
+      </w:pPr>
+      <w:r>
+        <w:rPr>
+          <w:rFonts w:ascii="Georgia" w:hAnsi="Georgia"/>
+          <w:b/>
+          <w:sz w:val="34"/>
+        </w:rPr>
+        <w:t>Response Needed</w:t>
       </w:r>
     </w:p>
     <w:p>
@@ -717,59 +618,9 @@
         <w:rPr>
           <w:rFonts w:ascii="Georgia" w:hAnsi="Georgia"/>
           <w:b w:val="0"/>
-          <w:sz w:val="32"/>
+          <w:sz w:val="26"/>
         </w:rPr>
-        <w:t>A personal carousel, showing a side of you beyond the business, work, and leadership content, small thoughts and realizations from the past month.</w:t>
-      </w:r>
-    </w:p>
-    <w:p>
-      <w:pPr>
-        <w:spacing w:after="320"/>
-      </w:pPr>
-      <w:r>
-        <w:rPr>
-          <w:rFonts w:ascii="Georgia" w:hAnsi="Georgia"/>
-          <w:b/>
-          <w:sz w:val="32"/>
-        </w:rPr>
-        <w:t xml:space="preserve">Link:  </w:t>
-      </w:r>
-      <w:hyperlink r:id="rId16">
-        <w:r>
-          <w:rPr>
-            <w:rFonts w:ascii="Georgia" w:hAnsi="Georgia"/>
-            <w:sz w:val="32"/>
-            <w:color w:val="0563C1"/>
-            <w:u w:val="single"/>
-          </w:rPr>
-          <w:t>View post</w:t>
-        </w:r>
-      </w:hyperlink>
-    </w:p>
-    <w:p>
-      <w:pPr>
-        <w:spacing w:before="200" w:after="350"/>
-      </w:pPr>
-      <w:r>
-        <w:rPr>
-          <w:rFonts w:ascii="Georgia" w:hAnsi="Georgia"/>
-          <w:b/>
-          <w:sz w:val="42"/>
-        </w:rPr>
-        <w:t>How to Respond</w:t>
-      </w:r>
-    </w:p>
-    <w:p>
-      <w:pPr>
-        <w:spacing w:after="320"/>
-      </w:pPr>
-      <w:r>
-        <w:rPr>
-          <w:rFonts w:ascii="Georgia" w:hAnsi="Georgia"/>
-          <w:b w:val="0"/>
-          <w:sz w:val="32"/>
-        </w:rPr>
-        <w:t>For each item above, let us know: approved as is, or what you'd like changed. Nothing gets recorded, published, or built until you've signed off.</w:t>
+        <w:t>Per item: approved, or note what to change. Nothing gets recorded, published, or built until approved.</w:t>
       </w:r>
     </w:p>
     <w:sectPr>
@@ -1147,7 +998,7 @@
     <w:rsid w:val="00FC693F"/>
     <w:rPr>
       <w:rFonts w:ascii="Georgia" w:hAnsi="Georgia"/>
-      <w:sz w:val="32"/>
+      <w:sz w:val="30"/>
     </w:rPr>
   </w:style>
   <w:style w:type="paragraph" w:styleId="Header">

</xml_diff>

<commit_message>
Add "What We Need From You" section to the client action plan
Covers the three real asks that were missing: recordings, the weekly
shoot-day commitment, and the podcast co-host decision. Positioned
near the end, not leading the document.

Co-Authored-By: Claude Sonnet 5 <noreply@anthropic.com>
</commit_message>
<xml_diff>
--- a/Client-Facing/Sarene_Action_Plan.docx
+++ b/Client-Facing/Sarene_Action_Plan.docx
@@ -607,6 +607,109 @@
           <w:b/>
           <w:sz w:val="34"/>
         </w:rPr>
+        <w:t>7. What We Need From You</w:t>
+      </w:r>
+    </w:p>
+    <w:p>
+      <w:pPr>
+        <w:spacing w:after="80"/>
+        <w:ind w:left="280"/>
+      </w:pPr>
+      <w:r>
+        <w:rPr>
+          <w:rFonts w:ascii="Georgia" w:hAnsi="Georgia"/>
+          <w:b w:val="0"/>
+          <w:sz w:val="30"/>
+        </w:rPr>
+        <w:t xml:space="preserve">•  </w:t>
+      </w:r>
+      <w:r>
+        <w:rPr>
+          <w:rFonts w:ascii="Georgia" w:hAnsi="Georgia"/>
+          <w:b/>
+          <w:sz w:val="30"/>
+        </w:rPr>
+        <w:t xml:space="preserve">Recordings: </w:t>
+      </w:r>
+      <w:r>
+        <w:rPr>
+          <w:rFonts w:ascii="Georgia" w:hAnsi="Georgia"/>
+          <w:b w:val="0"/>
+          <w:sz w:val="30"/>
+        </w:rPr>
+        <w:t>your existing talk and seminar recordings, at least 3 to 4. NAUMD excluded, not recorded.</w:t>
+      </w:r>
+    </w:p>
+    <w:p>
+      <w:pPr>
+        <w:spacing w:after="80"/>
+        <w:ind w:left="280"/>
+      </w:pPr>
+      <w:r>
+        <w:rPr>
+          <w:rFonts w:ascii="Georgia" w:hAnsi="Georgia"/>
+          <w:b w:val="0"/>
+          <w:sz w:val="30"/>
+        </w:rPr>
+        <w:t xml:space="preserve">•  </w:t>
+      </w:r>
+      <w:r>
+        <w:rPr>
+          <w:rFonts w:ascii="Georgia" w:hAnsi="Georgia"/>
+          <w:b/>
+          <w:sz w:val="30"/>
+        </w:rPr>
+        <w:t xml:space="preserve">Weekly shoot block: </w:t>
+      </w:r>
+      <w:r>
+        <w:rPr>
+          <w:rFonts w:ascii="Georgia" w:hAnsi="Georgia"/>
+          <w:b w:val="0"/>
+          <w:sz w:val="30"/>
+        </w:rPr>
+        <w:t>1 to 3 hours, once a week, for on-camera recording. This is what makes the posting plan possible.</w:t>
+      </w:r>
+    </w:p>
+    <w:p>
+      <w:pPr>
+        <w:spacing w:after="80"/>
+        <w:ind w:left="280"/>
+      </w:pPr>
+      <w:r>
+        <w:rPr>
+          <w:rFonts w:ascii="Georgia" w:hAnsi="Georgia"/>
+          <w:b w:val="0"/>
+          <w:sz w:val="30"/>
+        </w:rPr>
+        <w:t xml:space="preserve">•  </w:t>
+      </w:r>
+      <w:r>
+        <w:rPr>
+          <w:rFonts w:ascii="Georgia" w:hAnsi="Georgia"/>
+          <w:b/>
+          <w:sz w:val="30"/>
+        </w:rPr>
+        <w:t xml:space="preserve">Podcast format: </w:t>
+      </w:r>
+      <w:r>
+        <w:rPr>
+          <w:rFonts w:ascii="Georgia" w:hAnsi="Georgia"/>
+          <w:b w:val="0"/>
+          <w:sz w:val="30"/>
+        </w:rPr>
+        <w:t>solo, or with a co-host or guest.</w:t>
+      </w:r>
+    </w:p>
+    <w:p>
+      <w:pPr>
+        <w:spacing w:before="160" w:after="160"/>
+      </w:pPr>
+      <w:r>
+        <w:rPr>
+          <w:rFonts w:ascii="Georgia" w:hAnsi="Georgia"/>
+          <w:b/>
+          <w:sz w:val="34"/>
+        </w:rPr>
         <w:t>Response Needed</w:t>
       </w:r>
     </w:p>

</xml_diff>

<commit_message>
Add purpose/next-step framing to each content section in the action plan
Scripts and LinkedIn posts framed as a draft test batch, approval
continues the same style into the ongoing monthly plan. Instagram post
framed differently, approval needed on idea and direction only, routes
to the designer once approved.

Co-Authored-By: Claude Sonnet 5 <noreply@anthropic.com>
</commit_message>
<xml_diff>
--- a/Client-Facing/Sarene_Action_Plan.docx
+++ b/Client-Facing/Sarene_Action_Plan.docx
@@ -238,6 +238,66 @@
       <w:r>
         <w:rPr>
           <w:rFonts w:ascii="Georgia" w:hAnsi="Georgia"/>
+          <w:b w:val="0"/>
+          <w:sz w:val="30"/>
+        </w:rPr>
+        <w:t xml:space="preserve">•  </w:t>
+      </w:r>
+      <w:r>
+        <w:rPr>
+          <w:rFonts w:ascii="Georgia" w:hAnsi="Georgia"/>
+          <w:b/>
+          <w:sz w:val="30"/>
+        </w:rPr>
+        <w:t xml:space="preserve">Purpose: </w:t>
+      </w:r>
+      <w:r>
+        <w:rPr>
+          <w:rFonts w:ascii="Georgia" w:hAnsi="Georgia"/>
+          <w:b w:val="0"/>
+          <w:sz w:val="30"/>
+        </w:rPr>
+        <w:t>a draft test batch, to check these align with your voice and values before we commit to a full month.</w:t>
+      </w:r>
+    </w:p>
+    <w:p>
+      <w:pPr>
+        <w:spacing w:after="80"/>
+        <w:ind w:left="280"/>
+      </w:pPr>
+      <w:r>
+        <w:rPr>
+          <w:rFonts w:ascii="Georgia" w:hAnsi="Georgia"/>
+          <w:b w:val="0"/>
+          <w:sz w:val="30"/>
+        </w:rPr>
+        <w:t xml:space="preserve">•  </w:t>
+      </w:r>
+      <w:r>
+        <w:rPr>
+          <w:rFonts w:ascii="Georgia" w:hAnsi="Georgia"/>
+          <w:b/>
+          <w:sz w:val="30"/>
+        </w:rPr>
+        <w:t xml:space="preserve">Next step: </w:t>
+      </w:r>
+      <w:r>
+        <w:rPr>
+          <w:rFonts w:ascii="Georgia" w:hAnsi="Georgia"/>
+          <w:b w:val="0"/>
+          <w:sz w:val="30"/>
+        </w:rPr>
+        <w:t>if approved, we continue producing scripts in this same style as part of the ongoing monthly plan.</w:t>
+      </w:r>
+    </w:p>
+    <w:p>
+      <w:pPr>
+        <w:spacing w:after="80"/>
+        <w:ind w:left="280"/>
+      </w:pPr>
+      <w:r>
+        <w:rPr>
+          <w:rFonts w:ascii="Georgia" w:hAnsi="Georgia"/>
           <w:b/>
           <w:sz w:val="30"/>
         </w:rPr>
@@ -428,6 +488,66 @@
       <w:r>
         <w:rPr>
           <w:rFonts w:ascii="Georgia" w:hAnsi="Georgia"/>
+          <w:b w:val="0"/>
+          <w:sz w:val="30"/>
+        </w:rPr>
+        <w:t xml:space="preserve">•  </w:t>
+      </w:r>
+      <w:r>
+        <w:rPr>
+          <w:rFonts w:ascii="Georgia" w:hAnsi="Georgia"/>
+          <w:b/>
+          <w:sz w:val="30"/>
+        </w:rPr>
+        <w:t xml:space="preserve">Purpose: </w:t>
+      </w:r>
+      <w:r>
+        <w:rPr>
+          <w:rFonts w:ascii="Georgia" w:hAnsi="Georgia"/>
+          <w:b w:val="0"/>
+          <w:sz w:val="30"/>
+        </w:rPr>
+        <w:t>same idea, a draft test batch to confirm direction before continuing.</w:t>
+      </w:r>
+    </w:p>
+    <w:p>
+      <w:pPr>
+        <w:spacing w:after="80"/>
+        <w:ind w:left="280"/>
+      </w:pPr>
+      <w:r>
+        <w:rPr>
+          <w:rFonts w:ascii="Georgia" w:hAnsi="Georgia"/>
+          <w:b w:val="0"/>
+          <w:sz w:val="30"/>
+        </w:rPr>
+        <w:t xml:space="preserve">•  </w:t>
+      </w:r>
+      <w:r>
+        <w:rPr>
+          <w:rFonts w:ascii="Georgia" w:hAnsi="Georgia"/>
+          <w:b/>
+          <w:sz w:val="30"/>
+        </w:rPr>
+        <w:t xml:space="preserve">Next step: </w:t>
+      </w:r>
+      <w:r>
+        <w:rPr>
+          <w:rFonts w:ascii="Georgia" w:hAnsi="Georgia"/>
+          <w:b w:val="0"/>
+          <w:sz w:val="30"/>
+        </w:rPr>
+        <w:t>if approved, these continue as part of the ongoing monthly LinkedIn plan.</w:t>
+      </w:r>
+    </w:p>
+    <w:p>
+      <w:pPr>
+        <w:spacing w:after="80"/>
+        <w:ind w:left="280"/>
+      </w:pPr>
+      <w:r>
+        <w:rPr>
+          <w:rFonts w:ascii="Georgia" w:hAnsi="Georgia"/>
           <w:b/>
           <w:sz w:val="30"/>
         </w:rPr>
@@ -554,6 +674,66 @@
           <w:sz w:val="34"/>
         </w:rPr>
         <w:t>6. Instagram Post (1)</w:t>
+      </w:r>
+    </w:p>
+    <w:p>
+      <w:pPr>
+        <w:spacing w:after="80"/>
+        <w:ind w:left="280"/>
+      </w:pPr>
+      <w:r>
+        <w:rPr>
+          <w:rFonts w:ascii="Georgia" w:hAnsi="Georgia"/>
+          <w:b w:val="0"/>
+          <w:sz w:val="30"/>
+        </w:rPr>
+        <w:t xml:space="preserve">•  </w:t>
+      </w:r>
+      <w:r>
+        <w:rPr>
+          <w:rFonts w:ascii="Georgia" w:hAnsi="Georgia"/>
+          <w:b/>
+          <w:sz w:val="30"/>
+        </w:rPr>
+        <w:t xml:space="preserve">Purpose: </w:t>
+      </w:r>
+      <w:r>
+        <w:rPr>
+          <w:rFonts w:ascii="Georgia" w:hAnsi="Georgia"/>
+          <w:b w:val="0"/>
+          <w:sz w:val="30"/>
+        </w:rPr>
+        <w:t>also a social media post, but what we need here is agreement on the idea and direction, not the exact wording, just enough to confirm this matches the vision you're going for.</w:t>
+      </w:r>
+    </w:p>
+    <w:p>
+      <w:pPr>
+        <w:spacing w:after="80"/>
+        <w:ind w:left="280"/>
+      </w:pPr>
+      <w:r>
+        <w:rPr>
+          <w:rFonts w:ascii="Georgia" w:hAnsi="Georgia"/>
+          <w:b w:val="0"/>
+          <w:sz w:val="30"/>
+        </w:rPr>
+        <w:t xml:space="preserve">•  </w:t>
+      </w:r>
+      <w:r>
+        <w:rPr>
+          <w:rFonts w:ascii="Georgia" w:hAnsi="Georgia"/>
+          <w:b/>
+          <w:sz w:val="30"/>
+        </w:rPr>
+        <w:t xml:space="preserve">Status: </w:t>
+      </w:r>
+      <w:r>
+        <w:rPr>
+          <w:rFonts w:ascii="Georgia" w:hAnsi="Georgia"/>
+          <w:b w:val="0"/>
+          <w:sz w:val="30"/>
+        </w:rPr>
+        <w:t>based on everything already in the strategy, this direction aligns. We need your approval to send it to the designer for the actual visual design, then we continue from there.</w:t>
       </w:r>
     </w:p>
     <w:p>
@@ -723,7 +903,7 @@
           <w:b w:val="0"/>
           <w:sz w:val="26"/>
         </w:rPr>
-        <w:t>Per item: approved, or note what to change. Nothing gets recorded, published, or built until approved.</w:t>
+        <w:t>Per item: approved, or note what to change. Nothing gets recorded, published, designed, or built until approved.</w:t>
       </w:r>
     </w:p>
     <w:sectPr>

</xml_diff>

<commit_message>
Fix podcast line accuracy, add login/media asks to client action plan
Podcast format was wrongly framed as an open choice, it's already
solo-hosted, only the co-host/guest addition is open. Added three real
missing asks: email login, social media logins across all platforms,
and a media library request.

Co-Authored-By: Claude Sonnet 5 <noreply@anthropic.com>
</commit_message>
<xml_diff>
--- a/Client-Facing/Sarene_Action_Plan.docx
+++ b/Client-Facing/Sarene_Action_Plan.docx
@@ -869,7 +869,7 @@
           <w:b/>
           <w:sz w:val="30"/>
         </w:rPr>
-        <w:t xml:space="preserve">Podcast format: </w:t>
+        <w:t xml:space="preserve">Podcast: </w:t>
       </w:r>
       <w:r>
         <w:rPr>
@@ -877,7 +877,97 @@
           <w:b w:val="0"/>
           <w:sz w:val="30"/>
         </w:rPr>
-        <w:t>solo, or with a co-host or guest.</w:t>
+        <w:t>format is already solo-hosted. Open question is whether a co-host or recurring guest ever gets added later, not the format itself.</w:t>
+      </w:r>
+    </w:p>
+    <w:p>
+      <w:pPr>
+        <w:spacing w:after="80"/>
+        <w:ind w:left="280"/>
+      </w:pPr>
+      <w:r>
+        <w:rPr>
+          <w:rFonts w:ascii="Georgia" w:hAnsi="Georgia"/>
+          <w:b w:val="0"/>
+          <w:sz w:val="30"/>
+        </w:rPr>
+        <w:t xml:space="preserve">•  </w:t>
+      </w:r>
+      <w:r>
+        <w:rPr>
+          <w:rFonts w:ascii="Georgia" w:hAnsi="Georgia"/>
+          <w:b/>
+          <w:sz w:val="30"/>
+        </w:rPr>
+        <w:t xml:space="preserve">Email login: </w:t>
+      </w:r>
+      <w:r>
+        <w:rPr>
+          <w:rFonts w:ascii="Georgia" w:hAnsi="Georgia"/>
+          <w:b w:val="0"/>
+          <w:sz w:val="30"/>
+        </w:rPr>
+        <w:t>access to manage outreach and communications on your behalf.</w:t>
+      </w:r>
+    </w:p>
+    <w:p>
+      <w:pPr>
+        <w:spacing w:after="80"/>
+        <w:ind w:left="280"/>
+      </w:pPr>
+      <w:r>
+        <w:rPr>
+          <w:rFonts w:ascii="Georgia" w:hAnsi="Georgia"/>
+          <w:b w:val="0"/>
+          <w:sz w:val="30"/>
+        </w:rPr>
+        <w:t xml:space="preserve">•  </w:t>
+      </w:r>
+      <w:r>
+        <w:rPr>
+          <w:rFonts w:ascii="Georgia" w:hAnsi="Georgia"/>
+          <w:b/>
+          <w:sz w:val="30"/>
+        </w:rPr>
+        <w:t xml:space="preserve">Social media logins: </w:t>
+      </w:r>
+      <w:r>
+        <w:rPr>
+          <w:rFonts w:ascii="Georgia" w:hAnsi="Georgia"/>
+          <w:b w:val="0"/>
+          <w:sz w:val="30"/>
+        </w:rPr>
+        <w:t>access to your Instagram, LinkedIn, Facebook, YouTube, and TikTok accounts, so we can actually publish and manage content.</w:t>
+      </w:r>
+    </w:p>
+    <w:p>
+      <w:pPr>
+        <w:spacing w:after="80"/>
+        <w:ind w:left="280"/>
+      </w:pPr>
+      <w:r>
+        <w:rPr>
+          <w:rFonts w:ascii="Georgia" w:hAnsi="Georgia"/>
+          <w:b w:val="0"/>
+          <w:sz w:val="30"/>
+        </w:rPr>
+        <w:t xml:space="preserve">•  </w:t>
+      </w:r>
+      <w:r>
+        <w:rPr>
+          <w:rFonts w:ascii="Georgia" w:hAnsi="Georgia"/>
+          <w:b/>
+          <w:sz w:val="30"/>
+        </w:rPr>
+        <w:t xml:space="preserve">Media library: </w:t>
+      </w:r>
+      <w:r>
+        <w:rPr>
+          <w:rFonts w:ascii="Georgia" w:hAnsi="Georgia"/>
+          <w:b w:val="0"/>
+          <w:sz w:val="30"/>
+        </w:rPr>
+        <w:t>existing photos and video beyond the talk recordings, for use as supporting content.</w:t>
       </w:r>
     </w:p>
     <w:p>

</xml_diff>